<commit_message>
New lists and imageS
</commit_message>
<xml_diff>
--- a/docs/BYNATIONALITY/Грузинки.docx
+++ b/docs/BYNATIONALITY/Грузинки.docx
@@ -812,7 +812,6 @@
                 <w:rFonts w:ascii="Arial" w:hAnsi="Arial" w:cs="Arial"/>
                 <w:sz w:val="16"/>
                 <w:szCs w:val="16"/>
-                <w:lang w:val="ru-RU"/>
               </w:rPr>
             </w:pPr>
             <w:r>
@@ -834,283 +833,6 @@
                 <w:lang w:val="ru-RU"/>
               </w:rPr>
               <w:t xml:space="preserve"> из дворян – 6; из крестьян – 4; из служащих – 3.</w:t>
-            </w:r>
-          </w:p>
-          <w:p>
-            <w:pPr>
-              <w:pStyle w:val="BodyText"/>
-              <w:spacing w:after="0"/>
-              <w:rPr>
-                <w:rFonts w:hint="eastAsia"/>
-                <w:sz w:val="18"/>
-                <w:szCs w:val="18"/>
-                <w:lang w:val="ru-RU"/>
-              </w:rPr>
-            </w:pPr>
-          </w:p>
-          <w:p>
-            <w:pPr>
-              <w:pStyle w:val="BodyText"/>
-              <w:spacing w:after="0"/>
-              <w:jc w:val="center"/>
-              <w:rPr>
-                <w:rFonts w:ascii="serif" w:hAnsi="serif" w:cs="serif" w:hint="eastAsia"/>
-                <w:b/>
-                <w:bCs/>
-                <w:sz w:val="18"/>
-                <w:szCs w:val="18"/>
-                <w:lang w:val="ru-RU"/>
-              </w:rPr>
-            </w:pPr>
-            <w:r>
-              <w:rPr>
-                <w:rFonts w:ascii="serif" w:hAnsi="serif" w:cs="serif"/>
-                <w:b/>
-                <w:bCs/>
-                <w:sz w:val="18"/>
-                <w:szCs w:val="18"/>
-                <w:lang w:val="ru-RU"/>
-              </w:rPr>
-              <w:t>ЧИСЛЕННОСТЬ РАССТРЕЛЯННЫХ ЖЕНЩИН ПО ГОДАМ</w:t>
-            </w:r>
-            <w:r>
-              <w:rPr>
-                <w:rFonts w:ascii="serif" w:hAnsi="serif" w:cs="serif"/>
-                <w:b/>
-                <w:bCs/>
-                <w:sz w:val="18"/>
-                <w:szCs w:val="18"/>
-                <w:lang w:val="ru-RU"/>
-              </w:rPr>
-              <w:t xml:space="preserve">, </w:t>
-            </w:r>
-            <w:proofErr w:type="gramStart"/>
-            <w:r>
-              <w:rPr>
-                <w:rFonts w:ascii="serif" w:hAnsi="serif" w:cs="serif"/>
-                <w:b/>
-                <w:bCs/>
-                <w:sz w:val="18"/>
-                <w:szCs w:val="18"/>
-                <w:lang w:val="ru-RU"/>
-              </w:rPr>
-              <w:t>1937</w:t>
-            </w:r>
-            <w:r>
-              <w:rPr>
-                <w:rFonts w:ascii="serif" w:hAnsi="serif" w:cs="serif"/>
-                <w:b/>
-                <w:bCs/>
-                <w:sz w:val="18"/>
-                <w:szCs w:val="18"/>
-                <w:lang w:val="ru-RU"/>
-              </w:rPr>
-              <w:t>-</w:t>
-            </w:r>
-            <w:r>
-              <w:rPr>
-                <w:rFonts w:ascii="serif" w:hAnsi="serif" w:cs="serif"/>
-                <w:b/>
-                <w:bCs/>
-                <w:sz w:val="18"/>
-                <w:szCs w:val="18"/>
-                <w:lang w:val="ru-RU"/>
-              </w:rPr>
-              <w:t>1942</w:t>
-            </w:r>
-            <w:proofErr w:type="gramEnd"/>
-            <w:r>
-              <w:rPr>
-                <w:rFonts w:ascii="serif" w:hAnsi="serif" w:cs="serif"/>
-                <w:b/>
-                <w:bCs/>
-                <w:sz w:val="18"/>
-                <w:szCs w:val="18"/>
-                <w:lang w:val="ru-RU"/>
-              </w:rPr>
-              <w:t xml:space="preserve"> гг.</w:t>
-            </w:r>
-          </w:p>
-          <w:p>
-            <w:pPr>
-              <w:pStyle w:val="BodyText"/>
-              <w:spacing w:after="0"/>
-              <w:jc w:val="center"/>
-              <w:rPr>
-                <w:rFonts w:hint="eastAsia"/>
-                <w:noProof/>
-                <w:lang w:val="ru-RU"/>
-              </w:rPr>
-            </w:pPr>
-            <w:r>
-              <w:rPr>
-                <w:rFonts w:hint="eastAsia"/>
-                <w:noProof/>
-                <w:lang w:val="ru-RU"/>
-              </w:rPr>
-            </w:r>
-            <w:r>
-              <w:rPr>
-                <w:noProof/>
-                <w:lang w:val="ru-RU"/>
-              </w:rPr>
-              <w:pict w14:anchorId="1A898FC6">
-                <v:shapetype id="_x0000_t75" coordsize="21600,21600" o:spt="75" o:preferrelative="t" path="m@4@5l@4@11@9@11@9@5xe" filled="f" stroked="f">
-                  <v:stroke joinstyle="miter"/>
-                  <v:formulas>
-                    <v:f eqn="if lineDrawn pixelLineWidth 0"/>
-                    <v:f eqn="sum @0 1 0"/>
-                    <v:f eqn="sum 0 0 @1"/>
-                    <v:f eqn="prod @2 1 2"/>
-                    <v:f eqn="prod @3 21600 pixelWidth"/>
-                    <v:f eqn="prod @3 21600 pixelHeight"/>
-                    <v:f eqn="sum @0 0 1"/>
-                    <v:f eqn="prod @6 1 2"/>
-                    <v:f eqn="prod @7 21600 pixelWidth"/>
-                    <v:f eqn="sum @8 21600 0"/>
-                    <v:f eqn="prod @7 21600 pixelHeight"/>
-                    <v:f eqn="sum @10 21600 0"/>
-                  </v:formulas>
-                  <v:path o:extrusionok="f" gradientshapeok="t" o:connecttype="rect"/>
-                  <o:lock v:ext="edit" aspectratio="t"/>
-                </v:shapetype>
-                <v:shape id="_x0000_s1030" type="#_x0000_t75" style="width:243.7pt;height:150pt;mso-left-percent:-10001;mso-top-percent:-10001;mso-position-horizontal:absolute;mso-position-horizontal-relative:char;mso-position-vertical:absolute;mso-position-vertical-relative:line;mso-left-percent:-10001;mso-top-percent:-10001">
-                  <v:imagedata r:id="rId5" o:title=""/>
-                  <w10:wrap type="none"/>
-                  <w10:anchorlock/>
-                </v:shape>
-              </w:pict>
-            </w:r>
-          </w:p>
-          <w:p>
-            <w:pPr>
-              <w:pStyle w:val="BodyText"/>
-              <w:spacing w:after="0"/>
-              <w:jc w:val="center"/>
-              <w:rPr>
-                <w:rFonts w:hint="eastAsia"/>
-                <w:noProof/>
-                <w:lang w:val="ru-RU"/>
-              </w:rPr>
-            </w:pPr>
-          </w:p>
-          <w:p>
-            <w:pPr>
-              <w:pStyle w:val="BodyText"/>
-              <w:spacing w:after="0"/>
-              <w:jc w:val="center"/>
-              <w:rPr>
-                <w:rFonts w:ascii="serif" w:hAnsi="serif" w:cs="serif" w:hint="eastAsia"/>
-                <w:b/>
-                <w:bCs/>
-                <w:sz w:val="18"/>
-                <w:szCs w:val="18"/>
-                <w:lang w:val="ru-RU"/>
-              </w:rPr>
-            </w:pPr>
-            <w:r>
-              <w:rPr>
-                <w:rFonts w:ascii="serif" w:hAnsi="serif" w:cs="serif"/>
-                <w:b/>
-                <w:bCs/>
-                <w:sz w:val="18"/>
-                <w:szCs w:val="18"/>
-                <w:lang w:val="ru-RU"/>
-              </w:rPr>
-              <w:t xml:space="preserve">ЧИСЛЕННОСТЬ РАССТРЕЛЯННЫХ ЖЕНЩИН ПО </w:t>
-            </w:r>
-            <w:r>
-              <w:rPr>
-                <w:rFonts w:ascii="serif" w:hAnsi="serif" w:cs="serif"/>
-                <w:b/>
-                <w:bCs/>
-                <w:sz w:val="18"/>
-                <w:szCs w:val="18"/>
-                <w:lang w:val="ru-RU"/>
-              </w:rPr>
-              <w:t xml:space="preserve">ВОЗРАСТАМ, </w:t>
-            </w:r>
-            <w:proofErr w:type="gramStart"/>
-            <w:r>
-              <w:rPr>
-                <w:rFonts w:ascii="serif" w:hAnsi="serif" w:cs="serif"/>
-                <w:b/>
-                <w:bCs/>
-                <w:sz w:val="18"/>
-                <w:szCs w:val="18"/>
-                <w:lang w:val="ru-RU"/>
-              </w:rPr>
-              <w:t>1937</w:t>
-            </w:r>
-            <w:r>
-              <w:rPr>
-                <w:rFonts w:ascii="serif" w:hAnsi="serif" w:cs="serif"/>
-                <w:b/>
-                <w:bCs/>
-                <w:sz w:val="18"/>
-                <w:szCs w:val="18"/>
-                <w:lang w:val="ru-RU"/>
-              </w:rPr>
-              <w:t>-</w:t>
-            </w:r>
-            <w:r>
-              <w:rPr>
-                <w:rFonts w:ascii="serif" w:hAnsi="serif" w:cs="serif"/>
-                <w:b/>
-                <w:bCs/>
-                <w:sz w:val="18"/>
-                <w:szCs w:val="18"/>
-                <w:lang w:val="ru-RU"/>
-              </w:rPr>
-              <w:t>1942</w:t>
-            </w:r>
-            <w:proofErr w:type="gramEnd"/>
-            <w:r>
-              <w:rPr>
-                <w:rFonts w:ascii="serif" w:hAnsi="serif" w:cs="serif"/>
-                <w:b/>
-                <w:bCs/>
-                <w:sz w:val="18"/>
-                <w:szCs w:val="18"/>
-                <w:lang w:val="ru-RU"/>
-              </w:rPr>
-              <w:t xml:space="preserve"> гг.</w:t>
-            </w:r>
-          </w:p>
-          <w:p>
-            <w:pPr>
-              <w:pStyle w:val="BodyText"/>
-              <w:spacing w:after="0"/>
-              <w:jc w:val="center"/>
-              <w:rPr>
-                <w:rFonts w:hint="eastAsia"/>
-                <w:sz w:val="18"/>
-                <w:szCs w:val="18"/>
-                <w:lang w:val="ru-RU"/>
-              </w:rPr>
-            </w:pPr>
-            <w:r>
-              <w:rPr>
-                <w:rFonts w:hint="eastAsia"/>
-                <w:noProof/>
-                <w:sz w:val="18"/>
-                <w:szCs w:val="18"/>
-                <w:lang w:val="ru-RU"/>
-              </w:rPr>
-            </w:r>
-            <w:r>
-              <w:rPr>
-                <w:sz w:val="18"/>
-                <w:szCs w:val="18"/>
-                <w:lang w:val="ru-RU"/>
-              </w:rPr>
-              <w:pict w14:anchorId="3503515A">
-                <v:shape id="_x0000_s1029" type="#_x0000_t75" style="width:326.2pt;height:221.2pt;mso-left-percent:-10001;mso-top-percent:-10001;mso-position-horizontal:absolute;mso-position-horizontal-relative:char;mso-position-vertical:absolute;mso-position-vertical-relative:line;mso-left-percent:-10001;mso-top-percent:-10001">
-                  <v:imagedata r:id="rId6" o:title=""/>
-                  <w10:wrap type="none"/>
-                  <w10:anchorlock/>
-                </v:shape>
-              </w:pict>
             </w:r>
           </w:p>
         </w:tc>
@@ -1120,12 +842,253 @@
       <w:pPr>
         <w:pStyle w:val="BodyText"/>
         <w:rPr>
-          <w:rFonts w:hint="eastAsia"/>
           <w:sz w:val="18"/>
           <w:szCs w:val="18"/>
           <w:lang w:val="ru-RU"/>
         </w:rPr>
       </w:pPr>
+    </w:p>
+    <w:p>
+      <w:pPr>
+        <w:pStyle w:val="BodyText"/>
+        <w:spacing w:after="0"/>
+        <w:jc w:val="center"/>
+        <w:rPr>
+          <w:rFonts w:ascii="serif" w:hAnsi="serif" w:cs="serif" w:hint="eastAsia"/>
+          <w:b/>
+          <w:bCs/>
+          <w:sz w:val="18"/>
+          <w:szCs w:val="18"/>
+          <w:lang w:val="ru-RU"/>
+        </w:rPr>
+      </w:pPr>
+      <w:r>
+        <w:rPr>
+          <w:rFonts w:ascii="serif" w:hAnsi="serif" w:cs="serif"/>
+          <w:b/>
+          <w:bCs/>
+          <w:sz w:val="18"/>
+          <w:szCs w:val="18"/>
+          <w:lang w:val="ru-RU"/>
+        </w:rPr>
+        <w:t>ЧИСЛЕННОСТЬ РАССТРЕЛЯННЫХ ЖЕНЩИН ПО ГОДАМ</w:t>
+      </w:r>
+      <w:r>
+        <w:rPr>
+          <w:rFonts w:ascii="serif" w:hAnsi="serif" w:cs="serif"/>
+          <w:b/>
+          <w:bCs/>
+          <w:sz w:val="18"/>
+          <w:szCs w:val="18"/>
+          <w:lang w:val="ru-RU"/>
+        </w:rPr>
+        <w:t xml:space="preserve">, </w:t>
+      </w:r>
+      <w:proofErr w:type="gramStart"/>
+      <w:r>
+        <w:rPr>
+          <w:rFonts w:ascii="serif" w:hAnsi="serif" w:cs="serif"/>
+          <w:b/>
+          <w:bCs/>
+          <w:sz w:val="18"/>
+          <w:szCs w:val="18"/>
+          <w:lang w:val="ru-RU"/>
+        </w:rPr>
+        <w:t>1937</w:t>
+      </w:r>
+      <w:r>
+        <w:rPr>
+          <w:rFonts w:ascii="serif" w:hAnsi="serif" w:cs="serif"/>
+          <w:b/>
+          <w:bCs/>
+          <w:sz w:val="18"/>
+          <w:szCs w:val="18"/>
+          <w:lang w:val="ru-RU"/>
+        </w:rPr>
+        <w:t>-</w:t>
+      </w:r>
+      <w:r>
+        <w:rPr>
+          <w:rFonts w:ascii="serif" w:hAnsi="serif" w:cs="serif"/>
+          <w:b/>
+          <w:bCs/>
+          <w:sz w:val="18"/>
+          <w:szCs w:val="18"/>
+          <w:lang w:val="ru-RU"/>
+        </w:rPr>
+        <w:t>1942</w:t>
+      </w:r>
+      <w:proofErr w:type="gramEnd"/>
+      <w:r>
+        <w:rPr>
+          <w:rFonts w:ascii="serif" w:hAnsi="serif" w:cs="serif"/>
+          <w:b/>
+          <w:bCs/>
+          <w:sz w:val="18"/>
+          <w:szCs w:val="18"/>
+          <w:lang w:val="ru-RU"/>
+        </w:rPr>
+        <w:t xml:space="preserve"> гг.</w:t>
+      </w:r>
+    </w:p>
+    <w:p>
+      <w:pPr>
+        <w:pStyle w:val="BodyText"/>
+        <w:spacing w:after="0"/>
+        <w:jc w:val="center"/>
+        <w:rPr>
+          <w:rFonts w:hint="eastAsia"/>
+          <w:noProof/>
+          <w:lang w:val="ru-RU"/>
+        </w:rPr>
+      </w:pPr>
+      <w:r>
+        <w:rPr>
+          <w:noProof/>
+          <w:lang w:val="ru-RU"/>
+        </w:rPr>
+        <w:pict w14:anchorId="7604B2A8">
+          <v:shapetype id="_x0000_t75" coordsize="21600,21600" o:spt="75" o:preferrelative="t" path="m@4@5l@4@11@9@11@9@5xe" filled="f" stroked="f">
+            <v:stroke joinstyle="miter"/>
+            <v:formulas>
+              <v:f eqn="if lineDrawn pixelLineWidth 0"/>
+              <v:f eqn="sum @0 1 0"/>
+              <v:f eqn="sum 0 0 @1"/>
+              <v:f eqn="prod @2 1 2"/>
+              <v:f eqn="prod @3 21600 pixelWidth"/>
+              <v:f eqn="prod @3 21600 pixelHeight"/>
+              <v:f eqn="sum @0 0 1"/>
+              <v:f eqn="prod @6 1 2"/>
+              <v:f eqn="prod @7 21600 pixelWidth"/>
+              <v:f eqn="sum @8 21600 0"/>
+              <v:f eqn="prod @7 21600 pixelHeight"/>
+              <v:f eqn="sum @10 21600 0"/>
+            </v:formulas>
+            <v:path o:extrusionok="f" gradientshapeok="t" o:connecttype="rect"/>
+            <o:lock v:ext="edit" aspectratio="t"/>
+          </v:shapetype>
+          <v:shape id="_x0000_i1029" type="#_x0000_t75" style="width:243.6pt;height:150pt;mso-left-percent:-10001;mso-top-percent:-10001;mso-position-horizontal:absolute;mso-position-horizontal-relative:char;mso-position-vertical:absolute;mso-position-vertical-relative:line;mso-left-percent:-10001;mso-top-percent:-10001">
+            <v:imagedata r:id="rId5" o:title=""/>
+          </v:shape>
+        </w:pict>
+      </w:r>
+    </w:p>
+    <w:p>
+      <w:pPr>
+        <w:pStyle w:val="BodyText"/>
+        <w:spacing w:after="0"/>
+        <w:jc w:val="center"/>
+        <w:rPr>
+          <w:rFonts w:hint="eastAsia"/>
+          <w:noProof/>
+          <w:lang w:val="ru-RU"/>
+        </w:rPr>
+      </w:pPr>
+    </w:p>
+    <w:p>
+      <w:pPr>
+        <w:pStyle w:val="BodyText"/>
+        <w:spacing w:after="0"/>
+        <w:jc w:val="center"/>
+        <w:rPr>
+          <w:rFonts w:ascii="serif" w:hAnsi="serif" w:cs="serif" w:hint="eastAsia"/>
+          <w:b/>
+          <w:bCs/>
+          <w:sz w:val="18"/>
+          <w:szCs w:val="18"/>
+          <w:lang w:val="ru-RU"/>
+        </w:rPr>
+      </w:pPr>
+      <w:r>
+        <w:rPr>
+          <w:rFonts w:ascii="serif" w:hAnsi="serif" w:cs="serif"/>
+          <w:b/>
+          <w:bCs/>
+          <w:sz w:val="18"/>
+          <w:szCs w:val="18"/>
+          <w:lang w:val="ru-RU"/>
+        </w:rPr>
+        <w:t xml:space="preserve">ЧИСЛЕННОСТЬ РАССТРЕЛЯННЫХ ЖЕНЩИН ПО </w:t>
+      </w:r>
+      <w:r>
+        <w:rPr>
+          <w:rFonts w:ascii="serif" w:hAnsi="serif" w:cs="serif"/>
+          <w:b/>
+          <w:bCs/>
+          <w:sz w:val="18"/>
+          <w:szCs w:val="18"/>
+          <w:lang w:val="ru-RU"/>
+        </w:rPr>
+        <w:t xml:space="preserve">ВОЗРАСТАМ, </w:t>
+      </w:r>
+      <w:proofErr w:type="gramStart"/>
+      <w:r>
+        <w:rPr>
+          <w:rFonts w:ascii="serif" w:hAnsi="serif" w:cs="serif"/>
+          <w:b/>
+          <w:bCs/>
+          <w:sz w:val="18"/>
+          <w:szCs w:val="18"/>
+          <w:lang w:val="ru-RU"/>
+        </w:rPr>
+        <w:t>1937</w:t>
+      </w:r>
+      <w:r>
+        <w:rPr>
+          <w:rFonts w:ascii="serif" w:hAnsi="serif" w:cs="serif"/>
+          <w:b/>
+          <w:bCs/>
+          <w:sz w:val="18"/>
+          <w:szCs w:val="18"/>
+          <w:lang w:val="ru-RU"/>
+        </w:rPr>
+        <w:t>-</w:t>
+      </w:r>
+      <w:r>
+        <w:rPr>
+          <w:rFonts w:ascii="serif" w:hAnsi="serif" w:cs="serif"/>
+          <w:b/>
+          <w:bCs/>
+          <w:sz w:val="18"/>
+          <w:szCs w:val="18"/>
+          <w:lang w:val="ru-RU"/>
+        </w:rPr>
+        <w:t>1942</w:t>
+      </w:r>
+      <w:proofErr w:type="gramEnd"/>
+      <w:r>
+        <w:rPr>
+          <w:rFonts w:ascii="serif" w:hAnsi="serif" w:cs="serif"/>
+          <w:b/>
+          <w:bCs/>
+          <w:sz w:val="18"/>
+          <w:szCs w:val="18"/>
+          <w:lang w:val="ru-RU"/>
+        </w:rPr>
+        <w:t xml:space="preserve"> гг.</w:t>
+      </w:r>
+    </w:p>
+    <w:p>
+      <w:pPr>
+        <w:pStyle w:val="BodyText"/>
+        <w:jc w:val="center"/>
+        <w:rPr>
+          <w:sz w:val="18"/>
+          <w:szCs w:val="18"/>
+        </w:rPr>
+      </w:pPr>
+      <w:r>
+        <w:rPr>
+          <w:sz w:val="18"/>
+          <w:szCs w:val="18"/>
+          <w:lang w:val="ru-RU"/>
+        </w:rPr>
+        <w:pict w14:anchorId="2D46CDF2">
+          <v:shape id="_x0000_i1030" type="#_x0000_t75" style="width:326.4pt;height:221.4pt;mso-left-percent:-10001;mso-top-percent:-10001;mso-position-horizontal:absolute;mso-position-horizontal-relative:char;mso-position-vertical:absolute;mso-position-vertical-relative:line;mso-left-percent:-10001;mso-top-percent:-10001">
+            <v:imagedata r:id="rId6" o:title=""/>
+          </v:shape>
+        </w:pict>
+      </w:r>
     </w:p>
     <w:p>
       <w:pPr>
@@ -1195,6 +1158,7 @@
                 <w:szCs w:val="16"/>
                 <w:lang w:val="ru-RU"/>
               </w:rPr>
+              <w:lastRenderedPageBreak/>
               <w:t>Амиреджиби</w:t>
             </w:r>
             <w:proofErr w:type="spellEnd"/>
@@ -4556,7 +4520,47 @@
                 <w:szCs w:val="16"/>
                 <w:lang w:val="ru-RU"/>
               </w:rPr>
-              <w:t xml:space="preserve">Дата рождения: 1904 г., Место рождения: г. Гори, служащая, образование: среднее, бывший секретарь Орджоникидзевского РК ТО ЛКСМ Гр., до </w:t>
+              <w:t xml:space="preserve">Дата рождения: 1904 г., Место рождения: г. Гори, служащая, образование: среднее, бывший секретарь Орджоникидзевского РК ТО ЛКСМ Гр., до ареста инструктор Орджоникидзевского РК ТО КП (б) Грузии, бывший член ВКП(б) с 1930 г., Арестована: 4-й отдел УГБ НКВД ГССР. Обвинение: </w:t>
+            </w:r>
+            <w:proofErr w:type="spellStart"/>
+            <w:r>
+              <w:rPr>
+                <w:rFonts w:ascii="Arial" w:hAnsi="Arial" w:cs="Arial"/>
+                <w:sz w:val="16"/>
+                <w:szCs w:val="16"/>
+                <w:lang w:val="ru-RU"/>
+              </w:rPr>
+              <w:t>Далакишвили</w:t>
+            </w:r>
+            <w:proofErr w:type="spellEnd"/>
+            <w:r>
+              <w:rPr>
+                <w:rFonts w:ascii="Arial" w:hAnsi="Arial" w:cs="Arial"/>
+                <w:sz w:val="16"/>
+                <w:szCs w:val="16"/>
+                <w:lang w:val="ru-RU"/>
+              </w:rPr>
+              <w:t xml:space="preserve"> Р. И. в 1936 году была завербована в к-р молодежную организацию правых </w:t>
+            </w:r>
+            <w:proofErr w:type="spellStart"/>
+            <w:r>
+              <w:rPr>
+                <w:rFonts w:ascii="Arial" w:hAnsi="Arial" w:cs="Arial"/>
+                <w:sz w:val="16"/>
+                <w:szCs w:val="16"/>
+                <w:lang w:val="ru-RU"/>
+              </w:rPr>
+              <w:t>Георгобиани</w:t>
+            </w:r>
+            <w:proofErr w:type="spellEnd"/>
+            <w:r>
+              <w:rPr>
+                <w:rFonts w:ascii="Arial" w:hAnsi="Arial" w:cs="Arial"/>
+                <w:sz w:val="16"/>
+                <w:szCs w:val="16"/>
+                <w:lang w:val="ru-RU"/>
+              </w:rPr>
+              <w:t xml:space="preserve"> Г. будучи вовлечена в к-р организацию </w:t>
             </w:r>
             <w:r>
               <w:rPr>
@@ -4566,47 +4570,7 @@
                 <w:lang w:val="ru-RU"/>
               </w:rPr>
               <w:lastRenderedPageBreak/>
-              <w:t xml:space="preserve">ареста инструктор Орджоникидзевского РК ТО КП (б) Грузии, бывший член ВКП(б) с 1930 г., Арестована: 4-й отдел УГБ НКВД ГССР. Обвинение: </w:t>
-            </w:r>
-            <w:proofErr w:type="spellStart"/>
-            <w:r>
-              <w:rPr>
-                <w:rFonts w:ascii="Arial" w:hAnsi="Arial" w:cs="Arial"/>
-                <w:sz w:val="16"/>
-                <w:szCs w:val="16"/>
-                <w:lang w:val="ru-RU"/>
-              </w:rPr>
-              <w:t>Далакишвили</w:t>
-            </w:r>
-            <w:proofErr w:type="spellEnd"/>
-            <w:r>
-              <w:rPr>
-                <w:rFonts w:ascii="Arial" w:hAnsi="Arial" w:cs="Arial"/>
-                <w:sz w:val="16"/>
-                <w:szCs w:val="16"/>
-                <w:lang w:val="ru-RU"/>
-              </w:rPr>
-              <w:t xml:space="preserve"> Р. И. в 1936 году была завербована в к-р молодежную организацию правых </w:t>
-            </w:r>
-            <w:proofErr w:type="spellStart"/>
-            <w:r>
-              <w:rPr>
-                <w:rFonts w:ascii="Arial" w:hAnsi="Arial" w:cs="Arial"/>
-                <w:sz w:val="16"/>
-                <w:szCs w:val="16"/>
-                <w:lang w:val="ru-RU"/>
-              </w:rPr>
-              <w:t>Георгобиани</w:t>
-            </w:r>
-            <w:proofErr w:type="spellEnd"/>
-            <w:r>
-              <w:rPr>
-                <w:rFonts w:ascii="Arial" w:hAnsi="Arial" w:cs="Arial"/>
-                <w:sz w:val="16"/>
-                <w:szCs w:val="16"/>
-                <w:lang w:val="ru-RU"/>
-              </w:rPr>
-              <w:t xml:space="preserve"> Г. будучи вовлечена в к-р организацию правых </w:t>
+              <w:t xml:space="preserve">правых </w:t>
             </w:r>
             <w:proofErr w:type="spellStart"/>
             <w:r>
@@ -8514,17 +8478,7 @@
                 <w:szCs w:val="16"/>
                 <w:lang w:val="ru-RU"/>
               </w:rPr>
-              <w:t xml:space="preserve">Приговорена: тройка при УНКВД по Дальстрою 14 сентября 1937 </w:t>
-            </w:r>
-            <w:r>
-              <w:rPr>
-                <w:rFonts w:ascii="Arial" w:hAnsi="Arial" w:cs="Arial"/>
-                <w:sz w:val="16"/>
-                <w:szCs w:val="16"/>
-                <w:lang w:val="ru-RU"/>
-              </w:rPr>
-              <w:lastRenderedPageBreak/>
-              <w:t xml:space="preserve">г., </w:t>
+              <w:t xml:space="preserve">Приговорена: тройка при УНКВД по Дальстрою 14 сентября 1937 г., </w:t>
             </w:r>
             <w:proofErr w:type="spellStart"/>
             <w:r>
@@ -13407,7 +13361,6 @@
                 <w:sz w:val="16"/>
                 <w:szCs w:val="16"/>
               </w:rPr>
-              <w:lastRenderedPageBreak/>
               <w:t>Источник</w:t>
             </w:r>
             <w:proofErr w:type="spellEnd"/>
@@ -13603,7 +13556,6 @@
                 <w:szCs w:val="16"/>
                 <w:lang w:val="ru-RU"/>
               </w:rPr>
-              <w:lastRenderedPageBreak/>
               <w:t>С</w:t>
             </w:r>
             <w:r>
@@ -13680,6 +13632,7 @@
                 <w:szCs w:val="16"/>
                 <w:lang w:val="ru-RU"/>
               </w:rPr>
+              <w:lastRenderedPageBreak/>
               <w:t>Род. в 1883, Ахалцихский район, г. Ахалцихе, Грузия, грузинка. Род занятий: до ареста работала в Институте водного хозяйства. Образование высшее. Осуждена Тройкой при НКВД ГССР 05.05.1938. Мера наказания: расстрел с конфискацией личного имущества...* Список от 19 апреля 1938г.</w:t>
             </w:r>
             <w:r>
@@ -13862,6 +13815,7 @@
                 <w:szCs w:val="16"/>
                 <w:lang w:val="ru-RU"/>
               </w:rPr>
+              <w:lastRenderedPageBreak/>
               <w:t>Сулаквелидзе</w:t>
             </w:r>
             <w:proofErr w:type="spellEnd"/>

</xml_diff>